<commit_message>
Hyperparameter Tuning & Model Evaluation Report update
</commit_message>
<xml_diff>
--- a/final_delivery/Hyperparameter Tuning & Model Evaluation Report.docx
+++ b/final_delivery/Hyperparameter Tuning & Model Evaluation Report.docx
@@ -117,6 +117,13 @@
       <w:pPr>
         <w:rPr>
           <w:rFonts w:ascii="Times New Roman" w:hAnsi="Times New Roman" w:cs="Times New Roman"/>
+        </w:rPr>
+      </w:pPr>
+    </w:p>
+    <w:p>
+      <w:pPr>
+        <w:rPr>
+          <w:rFonts w:ascii="Times New Roman" w:hAnsi="Times New Roman" w:cs="Times New Roman"/>
           <w:b/>
           <w:bCs/>
           <w:sz w:val="28"/>
@@ -266,6 +273,7 @@
     </w:p>
     <w:p>
       <w:pPr>
+        <w:jc w:val="both"/>
         <w:rPr>
           <w:rFonts w:ascii="Times New Roman" w:hAnsi="Times New Roman" w:cs="Times New Roman"/>
         </w:rPr>
@@ -294,7 +302,7 @@
       <w:r>
         <w:rPr>
           <w:rFonts w:ascii="Times New Roman" w:hAnsi="Times New Roman" w:cs="Times New Roman"/>
-          <w:highlight w:val="lightGray"/>
+          <w:shd w:val="clear" w:color="auto" w:fill="E7E6E6" w:themeFill="background2"/>
         </w:rPr>
         <w:t>scale_pos_weight</w:t>
       </w:r>
@@ -302,7 +310,7 @@
       <w:r>
         <w:rPr>
           <w:rFonts w:ascii="Times New Roman" w:hAnsi="Times New Roman" w:cs="Times New Roman"/>
-          <w:highlight w:val="lightGray"/>
+          <w:shd w:val="clear" w:color="auto" w:fill="E7E6E6" w:themeFill="background2"/>
         </w:rPr>
         <w:t xml:space="preserve"> = 141.59</w:t>
       </w:r>
@@ -310,26 +318,90 @@
         <w:rPr>
           <w:rFonts w:ascii="Times New Roman" w:hAnsi="Times New Roman" w:cs="Times New Roman"/>
         </w:rPr>
-        <w:t>) instead of SMOTE. This approach trains the model on the original data distribution while giving more importance to the rare positive class.</w:t>
-      </w:r>
-    </w:p>
-    <w:p>
-      <w:pPr>
-        <w:rPr>
-          <w:rFonts w:ascii="Times New Roman" w:hAnsi="Times New Roman" w:cs="Times New Roman"/>
-        </w:rPr>
-      </w:pPr>
-      <w:r>
-        <w:rPr>
-          <w:rFonts w:ascii="Times New Roman" w:hAnsi="Times New Roman" w:cs="Times New Roman"/>
-        </w:rPr>
+        <w:t>) instead of SMOTE. This approach trains the model on the original data distribution while giving more importance to the rare positive class, which feels more appropriate for real crime prediction.</w:t>
+      </w:r>
+    </w:p>
+    <w:p>
+      <w:pPr>
+        <w:rPr>
+          <w:rFonts w:ascii="Times New Roman" w:hAnsi="Times New Roman" w:cs="Times New Roman"/>
+        </w:rPr>
+      </w:pPr>
+      <w:r>
+        <w:rPr>
+          <w:rFonts w:ascii="Times New Roman" w:hAnsi="Times New Roman" w:cs="Times New Roman"/>
+          <w:b/>
+          <w:bCs/>
+        </w:rPr>
+        <w:t>Additional Models</w:t>
+      </w:r>
+      <w:r>
+        <w:rPr>
+          <w:rFonts w:ascii="Times New Roman" w:hAnsi="Times New Roman" w:cs="Times New Roman"/>
+        </w:rPr>
+        <w:br/>
+      </w:r>
+      <w:r>
+        <w:rPr>
+          <w:rFonts w:ascii="Times New Roman" w:hAnsi="Times New Roman" w:cs="Times New Roman"/>
+        </w:rPr>
+        <w:t xml:space="preserve">I chose to stick with </w:t>
+      </w:r>
+      <w:proofErr w:type="spellStart"/>
+      <w:r>
+        <w:rPr>
+          <w:rFonts w:ascii="Times New Roman" w:hAnsi="Times New Roman" w:cs="Times New Roman"/>
+        </w:rPr>
+        <w:t>XGBoost</w:t>
+      </w:r>
+      <w:proofErr w:type="spellEnd"/>
+      <w:r>
+        <w:rPr>
+          <w:rFonts w:ascii="Times New Roman" w:hAnsi="Times New Roman" w:cs="Times New Roman"/>
+        </w:rPr>
+        <w:t xml:space="preserve"> for this stage because it performed very well in the baseline and is known for handling imbalanced tabular data effectively. I did not test other models (Random Forest or </w:t>
+      </w:r>
+      <w:proofErr w:type="spellStart"/>
+      <w:r>
+        <w:rPr>
+          <w:rFonts w:ascii="Times New Roman" w:hAnsi="Times New Roman" w:cs="Times New Roman"/>
+        </w:rPr>
+        <w:t>LightGBM</w:t>
+      </w:r>
+      <w:proofErr w:type="spellEnd"/>
+      <w:r>
+        <w:rPr>
+          <w:rFonts w:ascii="Times New Roman" w:hAnsi="Times New Roman" w:cs="Times New Roman"/>
+        </w:rPr>
+        <w:t>) yet, I plan to compare them in the next phase before the final deliverable.</w:t>
+      </w:r>
+    </w:p>
+    <w:p>
+      <w:pPr>
+        <w:rPr>
+          <w:rFonts w:ascii="Times New Roman" w:hAnsi="Times New Roman" w:cs="Times New Roman"/>
+        </w:rPr>
+      </w:pPr>
+      <w:r>
+        <w:rPr>
+          <w:rFonts w:ascii="Times New Roman" w:hAnsi="Times New Roman" w:cs="Times New Roman"/>
+          <w:b/>
+          <w:bCs/>
+        </w:rPr>
+        <w:lastRenderedPageBreak/>
+        <w:t>Hyperparameter Tuning</w:t>
+      </w:r>
+      <w:r>
+        <w:rPr>
+          <w:rFonts w:ascii="Times New Roman" w:hAnsi="Times New Roman" w:cs="Times New Roman"/>
+        </w:rPr>
+        <w:br/>
         <w:t>I performed hyperparameter tuning using </w:t>
       </w:r>
       <w:proofErr w:type="spellStart"/>
       <w:r>
         <w:rPr>
           <w:rFonts w:ascii="Times New Roman" w:hAnsi="Times New Roman" w:cs="Times New Roman"/>
-          <w:highlight w:val="lightGray"/>
         </w:rPr>
         <w:t>RandomizedSearchCV</w:t>
       </w:r>
@@ -358,7 +430,7 @@
       <w:r>
         <w:rPr>
           <w:rFonts w:ascii="Times New Roman" w:hAnsi="Times New Roman" w:cs="Times New Roman"/>
-          <w:highlight w:val="lightGray"/>
+          <w:shd w:val="clear" w:color="auto" w:fill="E7E6E6" w:themeFill="background2"/>
         </w:rPr>
         <w:t>n_estimators</w:t>
       </w:r>
@@ -373,7 +445,7 @@
       <w:r>
         <w:rPr>
           <w:rFonts w:ascii="Times New Roman" w:hAnsi="Times New Roman" w:cs="Times New Roman"/>
-          <w:highlight w:val="lightGray"/>
+          <w:shd w:val="clear" w:color="auto" w:fill="E7E6E6" w:themeFill="background2"/>
         </w:rPr>
         <w:t>max_depth</w:t>
       </w:r>
@@ -388,7 +460,7 @@
       <w:r>
         <w:rPr>
           <w:rFonts w:ascii="Times New Roman" w:hAnsi="Times New Roman" w:cs="Times New Roman"/>
-          <w:highlight w:val="lightGray"/>
+          <w:shd w:val="clear" w:color="auto" w:fill="E7E6E6" w:themeFill="background2"/>
         </w:rPr>
         <w:t>learning_rate</w:t>
       </w:r>
@@ -402,7 +474,7 @@
       <w:r>
         <w:rPr>
           <w:rFonts w:ascii="Times New Roman" w:hAnsi="Times New Roman" w:cs="Times New Roman"/>
-          <w:highlight w:val="lightGray"/>
+          <w:shd w:val="clear" w:color="auto" w:fill="E7E6E6" w:themeFill="background2"/>
         </w:rPr>
         <w:t>subsample</w:t>
       </w:r>
@@ -416,7 +488,7 @@
       <w:r>
         <w:rPr>
           <w:rFonts w:ascii="Times New Roman" w:hAnsi="Times New Roman" w:cs="Times New Roman"/>
-          <w:highlight w:val="lightGray"/>
+          <w:shd w:val="clear" w:color="auto" w:fill="E7E6E6" w:themeFill="background2"/>
         </w:rPr>
         <w:t>colsample_bytree</w:t>
       </w:r>
@@ -430,30 +502,30 @@
     </w:p>
     <w:p>
       <w:pPr>
-        <w:rPr>
-          <w:rFonts w:ascii="Times New Roman" w:hAnsi="Times New Roman" w:cs="Times New Roman"/>
-        </w:rPr>
-      </w:pPr>
-    </w:p>
-    <w:p>
-      <w:pPr>
-        <w:rPr>
-          <w:rFonts w:ascii="Times New Roman" w:hAnsi="Times New Roman" w:cs="Times New Roman"/>
-        </w:rPr>
-      </w:pPr>
-      <w:r>
-        <w:rPr>
-          <w:rFonts w:ascii="Times New Roman" w:hAnsi="Times New Roman" w:cs="Times New Roman"/>
-        </w:rPr>
-        <w:lastRenderedPageBreak/>
-        <w:t>After tuning, I conducted two important additional analyses in Notebook 07:</w:t>
+        <w:pStyle w:val="NoSpacing"/>
+        <w:rPr>
+          <w:rFonts w:ascii="Times New Roman" w:hAnsi="Times New Roman" w:cs="Times New Roman"/>
+        </w:rPr>
+      </w:pPr>
+    </w:p>
+    <w:p>
+      <w:pPr>
+        <w:rPr>
+          <w:rFonts w:ascii="Times New Roman" w:hAnsi="Times New Roman" w:cs="Times New Roman"/>
+        </w:rPr>
+      </w:pPr>
+      <w:r>
+        <w:rPr>
+          <w:rFonts w:ascii="Times New Roman" w:hAnsi="Times New Roman" w:cs="Times New Roman"/>
+        </w:rPr>
+        <w:t>To control for overfitting I used:</w:t>
       </w:r>
     </w:p>
     <w:p>
       <w:pPr>
         <w:numPr>
           <w:ilvl w:val="0"/>
-          <w:numId w:val="1"/>
+          <w:numId w:val="6"/>
         </w:numPr>
         <w:rPr>
           <w:rFonts w:ascii="Times New Roman" w:hAnsi="Times New Roman" w:cs="Times New Roman"/>
@@ -462,37 +534,15 @@
       <w:r>
         <w:rPr>
           <w:rFonts w:ascii="Times New Roman" w:hAnsi="Times New Roman" w:cs="Times New Roman"/>
-          <w:b/>
-          <w:bCs/>
-        </w:rPr>
-        <w:t>Leakage test</w:t>
-      </w:r>
-      <w:r>
-        <w:rPr>
-          <w:rFonts w:ascii="Times New Roman" w:hAnsi="Times New Roman" w:cs="Times New Roman"/>
-        </w:rPr>
-        <w:t>: Removed the </w:t>
-      </w:r>
-      <w:proofErr w:type="spellStart"/>
-      <w:r>
-        <w:rPr>
-          <w:rFonts w:ascii="Times New Roman" w:hAnsi="Times New Roman" w:cs="Times New Roman"/>
-        </w:rPr>
-        <w:t>is_violent</w:t>
-      </w:r>
-      <w:proofErr w:type="spellEnd"/>
-      <w:r>
-        <w:rPr>
-          <w:rFonts w:ascii="Times New Roman" w:hAnsi="Times New Roman" w:cs="Times New Roman"/>
-        </w:rPr>
-        <w:t> proxy and re-evaluated the model.</w:t>
+        </w:rPr>
+        <w:t>3-fold cross-validation during the search</w:t>
       </w:r>
     </w:p>
     <w:p>
       <w:pPr>
         <w:numPr>
           <w:ilvl w:val="0"/>
-          <w:numId w:val="1"/>
+          <w:numId w:val="6"/>
         </w:numPr>
         <w:rPr>
           <w:rFonts w:ascii="Times New Roman" w:hAnsi="Times New Roman" w:cs="Times New Roman"/>
@@ -501,42 +551,115 @@
       <w:r>
         <w:rPr>
           <w:rFonts w:ascii="Times New Roman" w:hAnsi="Times New Roman" w:cs="Times New Roman"/>
-          <w:b/>
-          <w:bCs/>
-        </w:rPr>
-        <w:t>Fairness evaluation</w:t>
-      </w:r>
-      <w:r>
-        <w:rPr>
-          <w:rFonts w:ascii="Times New Roman" w:hAnsi="Times New Roman" w:cs="Times New Roman"/>
-        </w:rPr>
-        <w:t>: Examined model performance stratified by night vs day and by district.</w:t>
-      </w:r>
-    </w:p>
-    <w:p>
-      <w:pPr>
-        <w:rPr>
-          <w:rFonts w:ascii="Times New Roman" w:hAnsi="Times New Roman" w:cs="Times New Roman"/>
-        </w:rPr>
-      </w:pPr>
-      <w:r>
-        <w:rPr>
-          <w:rFonts w:ascii="Times New Roman" w:hAnsi="Times New Roman" w:cs="Times New Roman"/>
-        </w:rPr>
-        <w:t>All code is in Notebook 07. The final tuned model is saved in the </w:t>
-      </w:r>
-      <w:r>
-        <w:rPr>
-          <w:rFonts w:ascii="Times New Roman" w:hAnsi="Times New Roman" w:cs="Times New Roman"/>
-          <w:highlight w:val="lightGray"/>
-        </w:rPr>
-        <w:t>models/</w:t>
-      </w:r>
-      <w:r>
-        <w:rPr>
-          <w:rFonts w:ascii="Times New Roman" w:hAnsi="Times New Roman" w:cs="Times New Roman"/>
-        </w:rPr>
-        <w:t> folder.</w:t>
+        </w:rPr>
+        <w:t>Stratified train/test split to preserve class distribution</w:t>
+      </w:r>
+    </w:p>
+    <w:p>
+      <w:pPr>
+        <w:numPr>
+          <w:ilvl w:val="0"/>
+          <w:numId w:val="6"/>
+        </w:numPr>
+        <w:rPr>
+          <w:rFonts w:ascii="Times New Roman" w:hAnsi="Times New Roman" w:cs="Times New Roman"/>
+        </w:rPr>
+      </w:pPr>
+      <w:r>
+        <w:rPr>
+          <w:rFonts w:ascii="Times New Roman" w:hAnsi="Times New Roman" w:cs="Times New Roman"/>
+        </w:rPr>
+        <w:t xml:space="preserve">Conservative parameter ranges (e.g., </w:t>
+      </w:r>
+      <w:proofErr w:type="spellStart"/>
+      <w:r>
+        <w:rPr>
+          <w:rFonts w:ascii="Times New Roman" w:hAnsi="Times New Roman" w:cs="Times New Roman"/>
+        </w:rPr>
+        <w:t>max_depth</w:t>
+      </w:r>
+      <w:proofErr w:type="spellEnd"/>
+      <w:r>
+        <w:rPr>
+          <w:rFonts w:ascii="Times New Roman" w:hAnsi="Times New Roman" w:cs="Times New Roman"/>
+        </w:rPr>
+        <w:t xml:space="preserve"> limited to 4 in the final best model)</w:t>
+      </w:r>
+    </w:p>
+    <w:p>
+      <w:pPr>
+        <w:numPr>
+          <w:ilvl w:val="0"/>
+          <w:numId w:val="6"/>
+        </w:numPr>
+        <w:rPr>
+          <w:rFonts w:ascii="Times New Roman" w:hAnsi="Times New Roman" w:cs="Times New Roman"/>
+        </w:rPr>
+      </w:pPr>
+      <w:r>
+        <w:rPr>
+          <w:rFonts w:ascii="Times New Roman" w:hAnsi="Times New Roman" w:cs="Times New Roman"/>
+        </w:rPr>
+        <w:t>The built-in </w:t>
+      </w:r>
+      <w:proofErr w:type="spellStart"/>
+      <w:r>
+        <w:rPr>
+          <w:rFonts w:ascii="Times New Roman" w:hAnsi="Times New Roman" w:cs="Times New Roman"/>
+          <w:shd w:val="clear" w:color="auto" w:fill="E7E6E6" w:themeFill="background2"/>
+        </w:rPr>
+        <w:t>eval_metric</w:t>
+      </w:r>
+      <w:proofErr w:type="spellEnd"/>
+      <w:r>
+        <w:rPr>
+          <w:rFonts w:ascii="Times New Roman" w:hAnsi="Times New Roman" w:cs="Times New Roman"/>
+          <w:shd w:val="clear" w:color="auto" w:fill="E7E6E6" w:themeFill="background2"/>
+        </w:rPr>
+        <w:t>='</w:t>
+      </w:r>
+      <w:proofErr w:type="spellStart"/>
+      <w:r>
+        <w:rPr>
+          <w:rFonts w:ascii="Times New Roman" w:hAnsi="Times New Roman" w:cs="Times New Roman"/>
+          <w:shd w:val="clear" w:color="auto" w:fill="E7E6E6" w:themeFill="background2"/>
+        </w:rPr>
+        <w:t>aucpr</w:t>
+      </w:r>
+      <w:proofErr w:type="spellEnd"/>
+      <w:r>
+        <w:rPr>
+          <w:rFonts w:ascii="Times New Roman" w:hAnsi="Times New Roman" w:cs="Times New Roman"/>
+          <w:shd w:val="clear" w:color="auto" w:fill="E7E6E6" w:themeFill="background2"/>
+        </w:rPr>
+        <w:t>'</w:t>
+      </w:r>
+      <w:r>
+        <w:rPr>
+          <w:rFonts w:ascii="Times New Roman" w:hAnsi="Times New Roman" w:cs="Times New Roman"/>
+        </w:rPr>
+        <w:t xml:space="preserve"> in </w:t>
+      </w:r>
+      <w:proofErr w:type="spellStart"/>
+      <w:r>
+        <w:rPr>
+          <w:rFonts w:ascii="Times New Roman" w:hAnsi="Times New Roman" w:cs="Times New Roman"/>
+        </w:rPr>
+        <w:t>XGBoost</w:t>
+      </w:r>
+      <w:proofErr w:type="spellEnd"/>
+    </w:p>
+    <w:p>
+      <w:pPr>
+        <w:rPr>
+          <w:rFonts w:ascii="Times New Roman" w:hAnsi="Times New Roman" w:cs="Times New Roman"/>
+        </w:rPr>
+      </w:pPr>
+      <w:r>
+        <w:rPr>
+          <w:rFonts w:ascii="Times New Roman" w:hAnsi="Times New Roman" w:cs="Times New Roman"/>
+        </w:rPr>
+        <w:t>All code is in Notebook 07. The final tuned model is saved in the models/ folder.</w:t>
       </w:r>
     </w:p>
     <w:p>
@@ -587,7 +710,7 @@
       <w:r>
         <w:rPr>
           <w:rFonts w:ascii="Times New Roman" w:hAnsi="Times New Roman" w:cs="Times New Roman"/>
-          <w:highlight w:val="lightGray"/>
+          <w:shd w:val="clear" w:color="auto" w:fill="E7E6E6" w:themeFill="background2"/>
         </w:rPr>
         <w:t>max_depth</w:t>
       </w:r>
@@ -613,7 +736,7 @@
       <w:r>
         <w:rPr>
           <w:rFonts w:ascii="Times New Roman" w:hAnsi="Times New Roman" w:cs="Times New Roman"/>
-          <w:highlight w:val="lightGray"/>
+          <w:shd w:val="clear" w:color="auto" w:fill="E7E6E6" w:themeFill="background2"/>
         </w:rPr>
         <w:t>learning_rate</w:t>
       </w:r>
@@ -639,7 +762,7 @@
       <w:r>
         <w:rPr>
           <w:rFonts w:ascii="Times New Roman" w:hAnsi="Times New Roman" w:cs="Times New Roman"/>
-          <w:highlight w:val="lightGray"/>
+          <w:shd w:val="clear" w:color="auto" w:fill="E7E6E6" w:themeFill="background2"/>
         </w:rPr>
         <w:t>n_estimators</w:t>
       </w:r>
@@ -664,7 +787,7 @@
       <w:r>
         <w:rPr>
           <w:rFonts w:ascii="Times New Roman" w:hAnsi="Times New Roman" w:cs="Times New Roman"/>
-          <w:highlight w:val="lightGray"/>
+          <w:shd w:val="clear" w:color="auto" w:fill="E7E6E6" w:themeFill="background2"/>
         </w:rPr>
         <w:t>subsample</w:t>
       </w:r>
@@ -689,7 +812,7 @@
       <w:r>
         <w:rPr>
           <w:rFonts w:ascii="Times New Roman" w:hAnsi="Times New Roman" w:cs="Times New Roman"/>
-          <w:highlight w:val="lightGray"/>
+          <w:shd w:val="clear" w:color="auto" w:fill="E7E6E6" w:themeFill="background2"/>
         </w:rPr>
         <w:t>colsample_bytree</w:t>
       </w:r>
@@ -715,7 +838,7 @@
       <w:r>
         <w:rPr>
           <w:rFonts w:ascii="Times New Roman" w:hAnsi="Times New Roman" w:cs="Times New Roman"/>
-          <w:highlight w:val="lightGray"/>
+          <w:shd w:val="clear" w:color="auto" w:fill="E7E6E6" w:themeFill="background2"/>
         </w:rPr>
         <w:t>scale_pos_weight</w:t>
       </w:r>
@@ -779,7 +902,7 @@
       <w:r>
         <w:rPr>
           <w:rFonts w:ascii="Times New Roman" w:hAnsi="Times New Roman" w:cs="Times New Roman"/>
-          <w:highlight w:val="lightGray"/>
+          <w:shd w:val="clear" w:color="auto" w:fill="E7E6E6" w:themeFill="background2"/>
         </w:rPr>
         <w:t>is_violent</w:t>
       </w:r>
@@ -808,7 +931,7 @@
       <w:r>
         <w:rPr>
           <w:rFonts w:ascii="Times New Roman" w:hAnsi="Times New Roman" w:cs="Times New Roman"/>
-          <w:highlight w:val="lightGray"/>
+          <w:shd w:val="clear" w:color="auto" w:fill="E7E6E6" w:themeFill="background2"/>
         </w:rPr>
         <w:t>is_violent</w:t>
       </w:r>
@@ -819,6 +942,27 @@
         </w:rPr>
         <w:t> feature was leaking information directly related to the target.</w:t>
       </w:r>
+    </w:p>
+    <w:p>
+      <w:pPr>
+        <w:rPr>
+          <w:rFonts w:ascii="Times New Roman" w:hAnsi="Times New Roman" w:cs="Times New Roman"/>
+        </w:rPr>
+      </w:pPr>
+    </w:p>
+    <w:p>
+      <w:pPr>
+        <w:rPr>
+          <w:rFonts w:ascii="Times New Roman" w:hAnsi="Times New Roman" w:cs="Times New Roman"/>
+        </w:rPr>
+      </w:pPr>
+    </w:p>
+    <w:p>
+      <w:pPr>
+        <w:rPr>
+          <w:rFonts w:ascii="Times New Roman" w:hAnsi="Times New Roman" w:cs="Times New Roman"/>
+        </w:rPr>
+      </w:pPr>
     </w:p>
     <w:p>
       <w:pPr>
@@ -832,6 +976,7 @@
           <w:b/>
           <w:bCs/>
         </w:rPr>
+        <w:lastRenderedPageBreak/>
         <w:t>Fairness Evaluation</w:t>
       </w:r>
     </w:p>
@@ -958,20 +1103,6 @@
       <w:pPr>
         <w:rPr>
           <w:rFonts w:ascii="Times New Roman" w:hAnsi="Times New Roman" w:cs="Times New Roman"/>
-        </w:rPr>
-      </w:pPr>
-    </w:p>
-    <w:p>
-      <w:pPr>
-        <w:rPr>
-          <w:rFonts w:ascii="Times New Roman" w:hAnsi="Times New Roman" w:cs="Times New Roman"/>
-        </w:rPr>
-      </w:pPr>
-    </w:p>
-    <w:p>
-      <w:pPr>
-        <w:rPr>
-          <w:rFonts w:ascii="Times New Roman" w:hAnsi="Times New Roman" w:cs="Times New Roman"/>
           <w:b/>
           <w:bCs/>
         </w:rPr>
@@ -982,7 +1113,6 @@
           <w:b/>
           <w:bCs/>
         </w:rPr>
-        <w:lastRenderedPageBreak/>
         <w:t>Figure 1: SHAP Feature Importance - Tuned Model (Top 15)</w:t>
       </w:r>
     </w:p>
@@ -1055,69 +1185,6 @@
           <w:bCs/>
         </w:rPr>
       </w:pPr>
-    </w:p>
-    <w:p>
-      <w:pPr>
-        <w:rPr>
-          <w:rFonts w:ascii="Times New Roman" w:hAnsi="Times New Roman" w:cs="Times New Roman"/>
-          <w:b/>
-          <w:bCs/>
-        </w:rPr>
-      </w:pPr>
-    </w:p>
-    <w:p>
-      <w:pPr>
-        <w:rPr>
-          <w:rFonts w:ascii="Times New Roman" w:hAnsi="Times New Roman" w:cs="Times New Roman"/>
-          <w:b/>
-          <w:bCs/>
-        </w:rPr>
-      </w:pPr>
-    </w:p>
-    <w:p>
-      <w:pPr>
-        <w:rPr>
-          <w:rFonts w:ascii="Times New Roman" w:hAnsi="Times New Roman" w:cs="Times New Roman"/>
-          <w:b/>
-          <w:bCs/>
-        </w:rPr>
-      </w:pPr>
-    </w:p>
-    <w:p>
-      <w:pPr>
-        <w:rPr>
-          <w:rFonts w:ascii="Times New Roman" w:hAnsi="Times New Roman" w:cs="Times New Roman"/>
-          <w:b/>
-          <w:bCs/>
-        </w:rPr>
-      </w:pPr>
-    </w:p>
-    <w:p>
-      <w:pPr>
-        <w:rPr>
-          <w:rFonts w:ascii="Times New Roman" w:hAnsi="Times New Roman" w:cs="Times New Roman"/>
-          <w:b/>
-          <w:bCs/>
-        </w:rPr>
-      </w:pPr>
-    </w:p>
-    <w:p>
-      <w:pPr>
-        <w:rPr>
-          <w:rFonts w:ascii="Times New Roman" w:hAnsi="Times New Roman" w:cs="Times New Roman"/>
-          <w:b/>
-          <w:bCs/>
-        </w:rPr>
-      </w:pPr>
-    </w:p>
-    <w:p>
-      <w:pPr>
-        <w:rPr>
-          <w:rFonts w:ascii="Times New Roman" w:hAnsi="Times New Roman" w:cs="Times New Roman"/>
-          <w:b/>
-          <w:bCs/>
-        </w:rPr>
-      </w:pPr>
       <w:r>
         <w:rPr>
           <w:rFonts w:ascii="Times New Roman" w:hAnsi="Times New Roman" w:cs="Times New Roman"/>
@@ -1209,7 +1276,6 @@
     </w:p>
     <w:p>
       <w:pPr>
-        <w:pStyle w:val="NoSpacing"/>
         <w:rPr>
           <w:rFonts w:ascii="Times New Roman" w:hAnsi="Times New Roman" w:cs="Times New Roman"/>
           <w:b/>
@@ -1230,36 +1296,23 @@
           <w:rFonts w:ascii="Times New Roman" w:hAnsi="Times New Roman" w:cs="Times New Roman"/>
           <w:b/>
           <w:bCs/>
-          <w:highlight w:val="lightGray"/>
+          <w:shd w:val="clear" w:color="auto" w:fill="E7E6E6" w:themeFill="background2"/>
         </w:rPr>
         <w:t>district_Unknown</w:t>
       </w:r>
       <w:proofErr w:type="spellEnd"/>
-    </w:p>
-    <w:p>
-      <w:pPr>
-        <w:pStyle w:val="NoSpacing"/>
-        <w:jc w:val="both"/>
-        <w:rPr>
-          <w:rFonts w:ascii="Times New Roman" w:hAnsi="Times New Roman" w:cs="Times New Roman"/>
-          <w:b/>
-          <w:bCs/>
-        </w:rPr>
-      </w:pPr>
-      <w:r>
+      <w:r>
+        <w:rPr>
+          <w:rFonts w:ascii="Times New Roman" w:hAnsi="Times New Roman" w:cs="Times New Roman"/>
+        </w:rPr>
         <w:br/>
-      </w:r>
-      <w:r>
-        <w:rPr>
-          <w:rFonts w:ascii="Times New Roman" w:hAnsi="Times New Roman" w:cs="Times New Roman"/>
-        </w:rPr>
         <w:t>In both SHAP plots you will notice a feature called </w:t>
       </w:r>
       <w:proofErr w:type="spellStart"/>
       <w:r>
         <w:rPr>
           <w:rFonts w:ascii="Times New Roman" w:hAnsi="Times New Roman" w:cs="Times New Roman"/>
-          <w:highlight w:val="lightGray"/>
+          <w:shd w:val="clear" w:color="auto" w:fill="E7E6E6" w:themeFill="background2"/>
         </w:rPr>
         <w:t>district_Unknown</w:t>
       </w:r>
@@ -1270,13 +1323,6 @@
         </w:rPr>
         <w:t>. This column was created during the one-hot encoding step because some incidents in the original dataset had no police district assigned (or were coded as "Unknown"). Approximately 5-10% of records fall into this category. The model learned that incidents with unknown district have a slightly different shooting probability pattern, which is why the feature shows up in the SHAP analysis.</w:t>
       </w:r>
-    </w:p>
-    <w:p>
-      <w:pPr>
-        <w:rPr>
-          <w:rFonts w:ascii="Times New Roman" w:hAnsi="Times New Roman" w:cs="Times New Roman"/>
-        </w:rPr>
-      </w:pPr>
     </w:p>
     <w:p>
       <w:pPr>
@@ -1362,7 +1408,7 @@
       <w:r>
         <w:rPr>
           <w:rFonts w:ascii="Times New Roman" w:hAnsi="Times New Roman" w:cs="Times New Roman"/>
-          <w:highlight w:val="lightGray"/>
+          <w:shd w:val="clear" w:color="auto" w:fill="E7E6E6" w:themeFill="background2"/>
         </w:rPr>
         <w:t>is_violent</w:t>
       </w:r>
@@ -1564,6 +1610,7 @@
     </w:p>
     <w:p>
       <w:pPr>
+        <w:jc w:val="both"/>
         <w:rPr>
           <w:rFonts w:ascii="Times New Roman" w:hAnsi="Times New Roman" w:cs="Times New Roman"/>
         </w:rPr>
@@ -1574,6 +1621,27 @@
         </w:rPr>
         <w:t>Overall, I feel the project is progressing well. The combination of strong baseline performance, class weighting, and clear SHAP interpretability gives me confidence that the final tool will be both accurate and practically useful for the Massachusetts State Police Crime Laboratory and Boston Police Department.</w:t>
       </w:r>
+    </w:p>
+    <w:p>
+      <w:pPr>
+        <w:rPr>
+          <w:rFonts w:ascii="Times New Roman" w:hAnsi="Times New Roman" w:cs="Times New Roman"/>
+        </w:rPr>
+      </w:pPr>
+    </w:p>
+    <w:p>
+      <w:pPr>
+        <w:rPr>
+          <w:rFonts w:ascii="Times New Roman" w:hAnsi="Times New Roman" w:cs="Times New Roman"/>
+        </w:rPr>
+      </w:pPr>
+    </w:p>
+    <w:p>
+      <w:pPr>
+        <w:rPr>
+          <w:rFonts w:ascii="Times New Roman" w:hAnsi="Times New Roman" w:cs="Times New Roman"/>
+        </w:rPr>
+      </w:pPr>
     </w:p>
     <w:p>
       <w:pPr>
@@ -1587,6 +1655,7 @@
           <w:b/>
           <w:bCs/>
         </w:rPr>
+        <w:lastRenderedPageBreak/>
         <w:t>GitHub Repository</w:t>
       </w:r>
       <w:r>
@@ -1606,11 +1675,6 @@
       </w:hyperlink>
     </w:p>
     <w:p>
-      <w:pPr>
-        <w:rPr>
-          <w:rFonts w:ascii="Times New Roman" w:hAnsi="Times New Roman" w:cs="Times New Roman"/>
-        </w:rPr>
-      </w:pPr>
       <w:r>
         <w:rPr>
           <w:rFonts w:ascii="Times New Roman" w:hAnsi="Times New Roman" w:cs="Times New Roman"/>
@@ -1640,6 +1704,820 @@
           <w:t>AI Forensic Triage Tool – Boston Shooting Risk Predictor</w:t>
         </w:r>
       </w:hyperlink>
+    </w:p>
+    <w:p/>
+    <w:p>
+      <w:pPr>
+        <w:rPr>
+          <w:rFonts w:ascii="Times New Roman" w:hAnsi="Times New Roman" w:cs="Times New Roman"/>
+          <w:b/>
+          <w:bCs/>
+        </w:rPr>
+      </w:pPr>
+      <w:r>
+        <w:rPr>
+          <w:rFonts w:ascii="Times New Roman" w:hAnsi="Times New Roman" w:cs="Times New Roman"/>
+          <w:b/>
+          <w:bCs/>
+        </w:rPr>
+        <w:t>Appendix – Data Dictionary</w:t>
+      </w:r>
+    </w:p>
+    <w:tbl>
+      <w:tblPr>
+        <w:tblW w:w="0" w:type="auto"/>
+        <w:tblCellMar>
+          <w:top w:w="15" w:type="dxa"/>
+          <w:left w:w="15" w:type="dxa"/>
+          <w:bottom w:w="15" w:type="dxa"/>
+          <w:right w:w="15" w:type="dxa"/>
+        </w:tblCellMar>
+        <w:tblLook w:val="04A0" w:firstRow="1" w:lastRow="0" w:firstColumn="1" w:lastColumn="0" w:noHBand="0" w:noVBand="1"/>
+      </w:tblPr>
+      <w:tblGrid>
+        <w:gridCol w:w="1877"/>
+        <w:gridCol w:w="6422"/>
+      </w:tblGrid>
+      <w:tr>
+        <w:trPr>
+          <w:tblHeader/>
+        </w:trPr>
+        <w:tc>
+          <w:tcPr>
+            <w:tcW w:w="0" w:type="auto"/>
+            <w:tcBorders>
+              <w:top w:val="single" w:sz="4" w:space="0" w:color="D1D9E0"/>
+              <w:left w:val="single" w:sz="4" w:space="0" w:color="D1D9E0"/>
+              <w:bottom w:val="single" w:sz="4" w:space="0" w:color="D1D9E0"/>
+              <w:right w:val="single" w:sz="4" w:space="0" w:color="D1D9E0"/>
+            </w:tcBorders>
+            <w:shd w:val="clear" w:color="auto" w:fill="FFFFFF"/>
+            <w:tcMar>
+              <w:top w:w="90" w:type="dxa"/>
+              <w:left w:w="195" w:type="dxa"/>
+              <w:bottom w:w="90" w:type="dxa"/>
+              <w:right w:w="195" w:type="dxa"/>
+            </w:tcMar>
+            <w:vAlign w:val="center"/>
+            <w:hideMark/>
+          </w:tcPr>
+          <w:p>
+            <w:pPr>
+              <w:jc w:val="center"/>
+              <w:rPr>
+                <w:rFonts w:ascii="Times New Roman" w:hAnsi="Times New Roman" w:cs="Times New Roman"/>
+                <w:b/>
+                <w:bCs/>
+              </w:rPr>
+            </w:pPr>
+            <w:r>
+              <w:rPr>
+                <w:rFonts w:ascii="Times New Roman" w:hAnsi="Times New Roman" w:cs="Times New Roman"/>
+                <w:b/>
+                <w:bCs/>
+              </w:rPr>
+              <w:t>Column Name</w:t>
+            </w:r>
+          </w:p>
+        </w:tc>
+        <w:tc>
+          <w:tcPr>
+            <w:tcW w:w="0" w:type="auto"/>
+            <w:tcBorders>
+              <w:top w:val="single" w:sz="4" w:space="0" w:color="D1D9E0"/>
+              <w:left w:val="single" w:sz="4" w:space="0" w:color="D1D9E0"/>
+              <w:bottom w:val="single" w:sz="4" w:space="0" w:color="D1D9E0"/>
+              <w:right w:val="single" w:sz="4" w:space="0" w:color="D1D9E0"/>
+            </w:tcBorders>
+            <w:shd w:val="clear" w:color="auto" w:fill="FFFFFF"/>
+            <w:tcMar>
+              <w:top w:w="90" w:type="dxa"/>
+              <w:left w:w="195" w:type="dxa"/>
+              <w:bottom w:w="90" w:type="dxa"/>
+              <w:right w:w="195" w:type="dxa"/>
+            </w:tcMar>
+            <w:vAlign w:val="center"/>
+            <w:hideMark/>
+          </w:tcPr>
+          <w:p>
+            <w:pPr>
+              <w:jc w:val="center"/>
+              <w:rPr>
+                <w:rFonts w:ascii="Times New Roman" w:hAnsi="Times New Roman" w:cs="Times New Roman"/>
+                <w:b/>
+                <w:bCs/>
+              </w:rPr>
+            </w:pPr>
+            <w:r>
+              <w:rPr>
+                <w:rFonts w:ascii="Times New Roman" w:hAnsi="Times New Roman" w:cs="Times New Roman"/>
+                <w:b/>
+                <w:bCs/>
+              </w:rPr>
+              <w:t>Description</w:t>
+            </w:r>
+          </w:p>
+        </w:tc>
+      </w:tr>
+      <w:tr>
+        <w:tc>
+          <w:tcPr>
+            <w:tcW w:w="0" w:type="auto"/>
+            <w:tcBorders>
+              <w:top w:val="single" w:sz="4" w:space="0" w:color="D1D9E0"/>
+              <w:left w:val="single" w:sz="4" w:space="0" w:color="D1D9E0"/>
+              <w:bottom w:val="single" w:sz="4" w:space="0" w:color="D1D9E0"/>
+              <w:right w:val="single" w:sz="4" w:space="0" w:color="D1D9E0"/>
+            </w:tcBorders>
+            <w:shd w:val="clear" w:color="auto" w:fill="FFFFFF"/>
+            <w:tcMar>
+              <w:top w:w="90" w:type="dxa"/>
+              <w:left w:w="195" w:type="dxa"/>
+              <w:bottom w:w="90" w:type="dxa"/>
+              <w:right w:w="195" w:type="dxa"/>
+            </w:tcMar>
+            <w:vAlign w:val="center"/>
+            <w:hideMark/>
+          </w:tcPr>
+          <w:p>
+            <w:pPr>
+              <w:jc w:val="center"/>
+              <w:rPr>
+                <w:rFonts w:ascii="Times New Roman" w:hAnsi="Times New Roman" w:cs="Times New Roman"/>
+              </w:rPr>
+            </w:pPr>
+            <w:r>
+              <w:rPr>
+                <w:rFonts w:ascii="Times New Roman" w:hAnsi="Times New Roman" w:cs="Times New Roman"/>
+              </w:rPr>
+              <w:t>hour</w:t>
+            </w:r>
+          </w:p>
+        </w:tc>
+        <w:tc>
+          <w:tcPr>
+            <w:tcW w:w="0" w:type="auto"/>
+            <w:tcBorders>
+              <w:top w:val="single" w:sz="4" w:space="0" w:color="D1D9E0"/>
+              <w:left w:val="single" w:sz="4" w:space="0" w:color="D1D9E0"/>
+              <w:bottom w:val="single" w:sz="4" w:space="0" w:color="D1D9E0"/>
+              <w:right w:val="single" w:sz="4" w:space="0" w:color="D1D9E0"/>
+            </w:tcBorders>
+            <w:shd w:val="clear" w:color="auto" w:fill="FFFFFF"/>
+            <w:tcMar>
+              <w:top w:w="90" w:type="dxa"/>
+              <w:left w:w="195" w:type="dxa"/>
+              <w:bottom w:w="90" w:type="dxa"/>
+              <w:right w:w="195" w:type="dxa"/>
+            </w:tcMar>
+            <w:vAlign w:val="center"/>
+            <w:hideMark/>
+          </w:tcPr>
+          <w:p>
+            <w:pPr>
+              <w:jc w:val="center"/>
+              <w:rPr>
+                <w:rFonts w:ascii="Times New Roman" w:hAnsi="Times New Roman" w:cs="Times New Roman"/>
+              </w:rPr>
+            </w:pPr>
+            <w:r>
+              <w:rPr>
+                <w:rFonts w:ascii="Times New Roman" w:hAnsi="Times New Roman" w:cs="Times New Roman"/>
+              </w:rPr>
+              <w:t>Hour of the day (0-23)</w:t>
+            </w:r>
+          </w:p>
+        </w:tc>
+      </w:tr>
+      <w:tr>
+        <w:tc>
+          <w:tcPr>
+            <w:tcW w:w="0" w:type="auto"/>
+            <w:tcBorders>
+              <w:top w:val="single" w:sz="4" w:space="0" w:color="D1D9E0"/>
+              <w:left w:val="single" w:sz="4" w:space="0" w:color="D1D9E0"/>
+              <w:bottom w:val="single" w:sz="4" w:space="0" w:color="D1D9E0"/>
+              <w:right w:val="single" w:sz="4" w:space="0" w:color="D1D9E0"/>
+            </w:tcBorders>
+            <w:shd w:val="clear" w:color="auto" w:fill="F6F8FA"/>
+            <w:tcMar>
+              <w:top w:w="90" w:type="dxa"/>
+              <w:left w:w="195" w:type="dxa"/>
+              <w:bottom w:w="90" w:type="dxa"/>
+              <w:right w:w="195" w:type="dxa"/>
+            </w:tcMar>
+            <w:vAlign w:val="center"/>
+            <w:hideMark/>
+          </w:tcPr>
+          <w:p>
+            <w:pPr>
+              <w:jc w:val="center"/>
+              <w:rPr>
+                <w:rFonts w:ascii="Times New Roman" w:hAnsi="Times New Roman" w:cs="Times New Roman"/>
+              </w:rPr>
+            </w:pPr>
+            <w:proofErr w:type="spellStart"/>
+            <w:r>
+              <w:rPr>
+                <w:rFonts w:ascii="Times New Roman" w:hAnsi="Times New Roman" w:cs="Times New Roman"/>
+              </w:rPr>
+              <w:t>is_night</w:t>
+            </w:r>
+            <w:proofErr w:type="spellEnd"/>
+          </w:p>
+        </w:tc>
+        <w:tc>
+          <w:tcPr>
+            <w:tcW w:w="0" w:type="auto"/>
+            <w:tcBorders>
+              <w:top w:val="single" w:sz="4" w:space="0" w:color="D1D9E0"/>
+              <w:left w:val="single" w:sz="4" w:space="0" w:color="D1D9E0"/>
+              <w:bottom w:val="single" w:sz="4" w:space="0" w:color="D1D9E0"/>
+              <w:right w:val="single" w:sz="4" w:space="0" w:color="D1D9E0"/>
+            </w:tcBorders>
+            <w:shd w:val="clear" w:color="auto" w:fill="F6F8FA"/>
+            <w:tcMar>
+              <w:top w:w="90" w:type="dxa"/>
+              <w:left w:w="195" w:type="dxa"/>
+              <w:bottom w:w="90" w:type="dxa"/>
+              <w:right w:w="195" w:type="dxa"/>
+            </w:tcMar>
+            <w:vAlign w:val="center"/>
+            <w:hideMark/>
+          </w:tcPr>
+          <w:p>
+            <w:pPr>
+              <w:jc w:val="center"/>
+              <w:rPr>
+                <w:rFonts w:ascii="Times New Roman" w:hAnsi="Times New Roman" w:cs="Times New Roman"/>
+              </w:rPr>
+            </w:pPr>
+            <w:r>
+              <w:rPr>
+                <w:rFonts w:ascii="Times New Roman" w:hAnsi="Times New Roman" w:cs="Times New Roman"/>
+              </w:rPr>
+              <w:t>Binary flag (1 = night 6PM–6AM)</w:t>
+            </w:r>
+          </w:p>
+        </w:tc>
+      </w:tr>
+      <w:tr>
+        <w:tc>
+          <w:tcPr>
+            <w:tcW w:w="0" w:type="auto"/>
+            <w:tcBorders>
+              <w:top w:val="single" w:sz="4" w:space="0" w:color="D1D9E0"/>
+              <w:left w:val="single" w:sz="4" w:space="0" w:color="D1D9E0"/>
+              <w:bottom w:val="single" w:sz="4" w:space="0" w:color="D1D9E0"/>
+              <w:right w:val="single" w:sz="4" w:space="0" w:color="D1D9E0"/>
+            </w:tcBorders>
+            <w:shd w:val="clear" w:color="auto" w:fill="FFFFFF"/>
+            <w:tcMar>
+              <w:top w:w="90" w:type="dxa"/>
+              <w:left w:w="195" w:type="dxa"/>
+              <w:bottom w:w="90" w:type="dxa"/>
+              <w:right w:w="195" w:type="dxa"/>
+            </w:tcMar>
+            <w:vAlign w:val="center"/>
+            <w:hideMark/>
+          </w:tcPr>
+          <w:p>
+            <w:pPr>
+              <w:jc w:val="center"/>
+              <w:rPr>
+                <w:rFonts w:ascii="Times New Roman" w:hAnsi="Times New Roman" w:cs="Times New Roman"/>
+              </w:rPr>
+            </w:pPr>
+            <w:proofErr w:type="spellStart"/>
+            <w:r>
+              <w:rPr>
+                <w:rFonts w:ascii="Times New Roman" w:hAnsi="Times New Roman" w:cs="Times New Roman"/>
+              </w:rPr>
+              <w:t>is_weekend</w:t>
+            </w:r>
+            <w:proofErr w:type="spellEnd"/>
+          </w:p>
+        </w:tc>
+        <w:tc>
+          <w:tcPr>
+            <w:tcW w:w="0" w:type="auto"/>
+            <w:tcBorders>
+              <w:top w:val="single" w:sz="4" w:space="0" w:color="D1D9E0"/>
+              <w:left w:val="single" w:sz="4" w:space="0" w:color="D1D9E0"/>
+              <w:bottom w:val="single" w:sz="4" w:space="0" w:color="D1D9E0"/>
+              <w:right w:val="single" w:sz="4" w:space="0" w:color="D1D9E0"/>
+            </w:tcBorders>
+            <w:shd w:val="clear" w:color="auto" w:fill="FFFFFF"/>
+            <w:tcMar>
+              <w:top w:w="90" w:type="dxa"/>
+              <w:left w:w="195" w:type="dxa"/>
+              <w:bottom w:w="90" w:type="dxa"/>
+              <w:right w:w="195" w:type="dxa"/>
+            </w:tcMar>
+            <w:vAlign w:val="center"/>
+            <w:hideMark/>
+          </w:tcPr>
+          <w:p>
+            <w:pPr>
+              <w:jc w:val="center"/>
+              <w:rPr>
+                <w:rFonts w:ascii="Times New Roman" w:hAnsi="Times New Roman" w:cs="Times New Roman"/>
+              </w:rPr>
+            </w:pPr>
+            <w:r>
+              <w:rPr>
+                <w:rFonts w:ascii="Times New Roman" w:hAnsi="Times New Roman" w:cs="Times New Roman"/>
+              </w:rPr>
+              <w:t>Binary flag (1 = weekend)</w:t>
+            </w:r>
+          </w:p>
+        </w:tc>
+      </w:tr>
+      <w:tr>
+        <w:tc>
+          <w:tcPr>
+            <w:tcW w:w="0" w:type="auto"/>
+            <w:tcBorders>
+              <w:top w:val="single" w:sz="4" w:space="0" w:color="D1D9E0"/>
+              <w:left w:val="single" w:sz="4" w:space="0" w:color="D1D9E0"/>
+              <w:bottom w:val="single" w:sz="4" w:space="0" w:color="D1D9E0"/>
+              <w:right w:val="single" w:sz="4" w:space="0" w:color="D1D9E0"/>
+            </w:tcBorders>
+            <w:shd w:val="clear" w:color="auto" w:fill="F6F8FA"/>
+            <w:tcMar>
+              <w:top w:w="90" w:type="dxa"/>
+              <w:left w:w="195" w:type="dxa"/>
+              <w:bottom w:w="90" w:type="dxa"/>
+              <w:right w:w="195" w:type="dxa"/>
+            </w:tcMar>
+            <w:vAlign w:val="center"/>
+            <w:hideMark/>
+          </w:tcPr>
+          <w:p>
+            <w:pPr>
+              <w:jc w:val="center"/>
+              <w:rPr>
+                <w:rFonts w:ascii="Times New Roman" w:hAnsi="Times New Roman" w:cs="Times New Roman"/>
+              </w:rPr>
+            </w:pPr>
+            <w:proofErr w:type="spellStart"/>
+            <w:r>
+              <w:rPr>
+                <w:rFonts w:ascii="Times New Roman" w:hAnsi="Times New Roman" w:cs="Times New Roman"/>
+              </w:rPr>
+              <w:t>is_violent</w:t>
+            </w:r>
+            <w:proofErr w:type="spellEnd"/>
+          </w:p>
+        </w:tc>
+        <w:tc>
+          <w:tcPr>
+            <w:tcW w:w="0" w:type="auto"/>
+            <w:tcBorders>
+              <w:top w:val="single" w:sz="4" w:space="0" w:color="D1D9E0"/>
+              <w:left w:val="single" w:sz="4" w:space="0" w:color="D1D9E0"/>
+              <w:bottom w:val="single" w:sz="4" w:space="0" w:color="D1D9E0"/>
+              <w:right w:val="single" w:sz="4" w:space="0" w:color="D1D9E0"/>
+            </w:tcBorders>
+            <w:shd w:val="clear" w:color="auto" w:fill="F6F8FA"/>
+            <w:tcMar>
+              <w:top w:w="90" w:type="dxa"/>
+              <w:left w:w="195" w:type="dxa"/>
+              <w:bottom w:w="90" w:type="dxa"/>
+              <w:right w:w="195" w:type="dxa"/>
+            </w:tcMar>
+            <w:vAlign w:val="center"/>
+            <w:hideMark/>
+          </w:tcPr>
+          <w:p>
+            <w:pPr>
+              <w:jc w:val="center"/>
+              <w:rPr>
+                <w:rFonts w:ascii="Times New Roman" w:hAnsi="Times New Roman" w:cs="Times New Roman"/>
+              </w:rPr>
+            </w:pPr>
+            <w:r>
+              <w:rPr>
+                <w:rFonts w:ascii="Times New Roman" w:hAnsi="Times New Roman" w:cs="Times New Roman"/>
+              </w:rPr>
+              <w:t>Violent offense proxy (1 = assault, robbery, homicide, etc.)</w:t>
+            </w:r>
+          </w:p>
+        </w:tc>
+      </w:tr>
+      <w:tr>
+        <w:tc>
+          <w:tcPr>
+            <w:tcW w:w="0" w:type="auto"/>
+            <w:tcBorders>
+              <w:top w:val="single" w:sz="4" w:space="0" w:color="D1D9E0"/>
+              <w:left w:val="single" w:sz="4" w:space="0" w:color="D1D9E0"/>
+              <w:bottom w:val="single" w:sz="4" w:space="0" w:color="D1D9E0"/>
+              <w:right w:val="single" w:sz="4" w:space="0" w:color="D1D9E0"/>
+            </w:tcBorders>
+            <w:shd w:val="clear" w:color="auto" w:fill="FFFFFF"/>
+            <w:tcMar>
+              <w:top w:w="90" w:type="dxa"/>
+              <w:left w:w="195" w:type="dxa"/>
+              <w:bottom w:w="90" w:type="dxa"/>
+              <w:right w:w="195" w:type="dxa"/>
+            </w:tcMar>
+            <w:vAlign w:val="center"/>
+            <w:hideMark/>
+          </w:tcPr>
+          <w:p>
+            <w:pPr>
+              <w:jc w:val="center"/>
+              <w:rPr>
+                <w:rFonts w:ascii="Times New Roman" w:hAnsi="Times New Roman" w:cs="Times New Roman"/>
+              </w:rPr>
+            </w:pPr>
+            <w:proofErr w:type="spellStart"/>
+            <w:r>
+              <w:rPr>
+                <w:rFonts w:ascii="Times New Roman" w:hAnsi="Times New Roman" w:cs="Times New Roman"/>
+              </w:rPr>
+              <w:t>poverty_rate</w:t>
+            </w:r>
+            <w:proofErr w:type="spellEnd"/>
+          </w:p>
+        </w:tc>
+        <w:tc>
+          <w:tcPr>
+            <w:tcW w:w="0" w:type="auto"/>
+            <w:tcBorders>
+              <w:top w:val="single" w:sz="4" w:space="0" w:color="D1D9E0"/>
+              <w:left w:val="single" w:sz="4" w:space="0" w:color="D1D9E0"/>
+              <w:bottom w:val="single" w:sz="4" w:space="0" w:color="D1D9E0"/>
+              <w:right w:val="single" w:sz="4" w:space="0" w:color="D1D9E0"/>
+            </w:tcBorders>
+            <w:shd w:val="clear" w:color="auto" w:fill="FFFFFF"/>
+            <w:tcMar>
+              <w:top w:w="90" w:type="dxa"/>
+              <w:left w:w="195" w:type="dxa"/>
+              <w:bottom w:w="90" w:type="dxa"/>
+              <w:right w:w="195" w:type="dxa"/>
+            </w:tcMar>
+            <w:vAlign w:val="center"/>
+            <w:hideMark/>
+          </w:tcPr>
+          <w:p>
+            <w:pPr>
+              <w:jc w:val="center"/>
+              <w:rPr>
+                <w:rFonts w:ascii="Times New Roman" w:hAnsi="Times New Roman" w:cs="Times New Roman"/>
+              </w:rPr>
+            </w:pPr>
+            <w:r>
+              <w:rPr>
+                <w:rFonts w:ascii="Times New Roman" w:hAnsi="Times New Roman" w:cs="Times New Roman"/>
+              </w:rPr>
+              <w:t>District-level poverty rate from ACS (proxy)</w:t>
+            </w:r>
+          </w:p>
+        </w:tc>
+      </w:tr>
+      <w:tr>
+        <w:tc>
+          <w:tcPr>
+            <w:tcW w:w="0" w:type="auto"/>
+            <w:tcBorders>
+              <w:top w:val="single" w:sz="4" w:space="0" w:color="D1D9E0"/>
+              <w:left w:val="single" w:sz="4" w:space="0" w:color="D1D9E0"/>
+              <w:bottom w:val="single" w:sz="4" w:space="0" w:color="D1D9E0"/>
+              <w:right w:val="single" w:sz="4" w:space="0" w:color="D1D9E0"/>
+            </w:tcBorders>
+            <w:shd w:val="clear" w:color="auto" w:fill="F6F8FA"/>
+            <w:tcMar>
+              <w:top w:w="90" w:type="dxa"/>
+              <w:left w:w="195" w:type="dxa"/>
+              <w:bottom w:w="90" w:type="dxa"/>
+              <w:right w:w="195" w:type="dxa"/>
+            </w:tcMar>
+            <w:vAlign w:val="center"/>
+            <w:hideMark/>
+          </w:tcPr>
+          <w:p>
+            <w:pPr>
+              <w:jc w:val="center"/>
+              <w:rPr>
+                <w:rFonts w:ascii="Times New Roman" w:hAnsi="Times New Roman" w:cs="Times New Roman"/>
+              </w:rPr>
+            </w:pPr>
+            <w:r>
+              <w:rPr>
+                <w:rFonts w:ascii="Times New Roman" w:hAnsi="Times New Roman" w:cs="Times New Roman"/>
+              </w:rPr>
+              <w:t>district_*</w:t>
+            </w:r>
+          </w:p>
+        </w:tc>
+        <w:tc>
+          <w:tcPr>
+            <w:tcW w:w="0" w:type="auto"/>
+            <w:tcBorders>
+              <w:top w:val="single" w:sz="4" w:space="0" w:color="D1D9E0"/>
+              <w:left w:val="single" w:sz="4" w:space="0" w:color="D1D9E0"/>
+              <w:bottom w:val="single" w:sz="4" w:space="0" w:color="D1D9E0"/>
+              <w:right w:val="single" w:sz="4" w:space="0" w:color="D1D9E0"/>
+            </w:tcBorders>
+            <w:shd w:val="clear" w:color="auto" w:fill="F6F8FA"/>
+            <w:tcMar>
+              <w:top w:w="90" w:type="dxa"/>
+              <w:left w:w="195" w:type="dxa"/>
+              <w:bottom w:w="90" w:type="dxa"/>
+              <w:right w:w="195" w:type="dxa"/>
+            </w:tcMar>
+            <w:vAlign w:val="center"/>
+            <w:hideMark/>
+          </w:tcPr>
+          <w:p>
+            <w:pPr>
+              <w:jc w:val="center"/>
+              <w:rPr>
+                <w:rFonts w:ascii="Times New Roman" w:hAnsi="Times New Roman" w:cs="Times New Roman"/>
+              </w:rPr>
+            </w:pPr>
+            <w:r>
+              <w:rPr>
+                <w:rFonts w:ascii="Times New Roman" w:hAnsi="Times New Roman" w:cs="Times New Roman"/>
+              </w:rPr>
+              <w:t xml:space="preserve">One-hot encoded police districts (including </w:t>
+            </w:r>
+            <w:proofErr w:type="spellStart"/>
+            <w:r>
+              <w:rPr>
+                <w:rFonts w:ascii="Times New Roman" w:hAnsi="Times New Roman" w:cs="Times New Roman"/>
+              </w:rPr>
+              <w:t>district_Unknown</w:t>
+            </w:r>
+            <w:proofErr w:type="spellEnd"/>
+            <w:r>
+              <w:rPr>
+                <w:rFonts w:ascii="Times New Roman" w:hAnsi="Times New Roman" w:cs="Times New Roman"/>
+              </w:rPr>
+              <w:t>)</w:t>
+            </w:r>
+          </w:p>
+        </w:tc>
+      </w:tr>
+      <w:tr>
+        <w:tc>
+          <w:tcPr>
+            <w:tcW w:w="0" w:type="auto"/>
+            <w:tcBorders>
+              <w:top w:val="single" w:sz="4" w:space="0" w:color="D1D9E0"/>
+              <w:left w:val="single" w:sz="4" w:space="0" w:color="D1D9E0"/>
+              <w:bottom w:val="single" w:sz="4" w:space="0" w:color="D1D9E0"/>
+              <w:right w:val="single" w:sz="4" w:space="0" w:color="D1D9E0"/>
+            </w:tcBorders>
+            <w:shd w:val="clear" w:color="auto" w:fill="FFFFFF"/>
+            <w:tcMar>
+              <w:top w:w="90" w:type="dxa"/>
+              <w:left w:w="195" w:type="dxa"/>
+              <w:bottom w:w="90" w:type="dxa"/>
+              <w:right w:w="195" w:type="dxa"/>
+            </w:tcMar>
+            <w:vAlign w:val="center"/>
+            <w:hideMark/>
+          </w:tcPr>
+          <w:p>
+            <w:pPr>
+              <w:jc w:val="center"/>
+              <w:rPr>
+                <w:rFonts w:ascii="Times New Roman" w:hAnsi="Times New Roman" w:cs="Times New Roman"/>
+              </w:rPr>
+            </w:pPr>
+            <w:r>
+              <w:rPr>
+                <w:rFonts w:ascii="Times New Roman" w:hAnsi="Times New Roman" w:cs="Times New Roman"/>
+              </w:rPr>
+              <w:t>SHOOTING</w:t>
+            </w:r>
+          </w:p>
+        </w:tc>
+        <w:tc>
+          <w:tcPr>
+            <w:tcW w:w="0" w:type="auto"/>
+            <w:tcBorders>
+              <w:top w:val="single" w:sz="4" w:space="0" w:color="D1D9E0"/>
+              <w:left w:val="single" w:sz="4" w:space="0" w:color="D1D9E0"/>
+              <w:bottom w:val="single" w:sz="4" w:space="0" w:color="D1D9E0"/>
+              <w:right w:val="single" w:sz="4" w:space="0" w:color="D1D9E0"/>
+            </w:tcBorders>
+            <w:shd w:val="clear" w:color="auto" w:fill="FFFFFF"/>
+            <w:tcMar>
+              <w:top w:w="90" w:type="dxa"/>
+              <w:left w:w="195" w:type="dxa"/>
+              <w:bottom w:w="90" w:type="dxa"/>
+              <w:right w:w="195" w:type="dxa"/>
+            </w:tcMar>
+            <w:vAlign w:val="center"/>
+            <w:hideMark/>
+          </w:tcPr>
+          <w:p>
+            <w:pPr>
+              <w:jc w:val="center"/>
+              <w:rPr>
+                <w:rFonts w:ascii="Times New Roman" w:hAnsi="Times New Roman" w:cs="Times New Roman"/>
+              </w:rPr>
+            </w:pPr>
+            <w:r>
+              <w:rPr>
+                <w:rFonts w:ascii="Times New Roman" w:hAnsi="Times New Roman" w:cs="Times New Roman"/>
+              </w:rPr>
+              <w:t>Target variable (1 = shooting incident)</w:t>
+            </w:r>
+          </w:p>
+        </w:tc>
+      </w:tr>
+      <w:tr>
+        <w:tc>
+          <w:tcPr>
+            <w:tcW w:w="0" w:type="auto"/>
+            <w:tcBorders>
+              <w:top w:val="single" w:sz="4" w:space="0" w:color="D1D9E0"/>
+              <w:left w:val="single" w:sz="4" w:space="0" w:color="D1D9E0"/>
+              <w:bottom w:val="single" w:sz="4" w:space="0" w:color="D1D9E0"/>
+              <w:right w:val="single" w:sz="4" w:space="0" w:color="D1D9E0"/>
+            </w:tcBorders>
+            <w:shd w:val="clear" w:color="auto" w:fill="F6F8FA"/>
+            <w:tcMar>
+              <w:top w:w="90" w:type="dxa"/>
+              <w:left w:w="195" w:type="dxa"/>
+              <w:bottom w:w="90" w:type="dxa"/>
+              <w:right w:w="195" w:type="dxa"/>
+            </w:tcMar>
+            <w:vAlign w:val="center"/>
+            <w:hideMark/>
+          </w:tcPr>
+          <w:p>
+            <w:pPr>
+              <w:jc w:val="center"/>
+              <w:rPr>
+                <w:rFonts w:ascii="Times New Roman" w:hAnsi="Times New Roman" w:cs="Times New Roman"/>
+              </w:rPr>
+            </w:pPr>
+            <w:proofErr w:type="spellStart"/>
+            <w:r>
+              <w:rPr>
+                <w:rFonts w:ascii="Times New Roman" w:hAnsi="Times New Roman" w:cs="Times New Roman"/>
+              </w:rPr>
+              <w:t>predicted_prob</w:t>
+            </w:r>
+            <w:proofErr w:type="spellEnd"/>
+          </w:p>
+        </w:tc>
+        <w:tc>
+          <w:tcPr>
+            <w:tcW w:w="0" w:type="auto"/>
+            <w:tcBorders>
+              <w:top w:val="single" w:sz="4" w:space="0" w:color="D1D9E0"/>
+              <w:left w:val="single" w:sz="4" w:space="0" w:color="D1D9E0"/>
+              <w:bottom w:val="single" w:sz="4" w:space="0" w:color="D1D9E0"/>
+              <w:right w:val="single" w:sz="4" w:space="0" w:color="D1D9E0"/>
+            </w:tcBorders>
+            <w:shd w:val="clear" w:color="auto" w:fill="F6F8FA"/>
+            <w:tcMar>
+              <w:top w:w="90" w:type="dxa"/>
+              <w:left w:w="195" w:type="dxa"/>
+              <w:bottom w:w="90" w:type="dxa"/>
+              <w:right w:w="195" w:type="dxa"/>
+            </w:tcMar>
+            <w:vAlign w:val="center"/>
+            <w:hideMark/>
+          </w:tcPr>
+          <w:p>
+            <w:pPr>
+              <w:jc w:val="center"/>
+              <w:rPr>
+                <w:rFonts w:ascii="Times New Roman" w:hAnsi="Times New Roman" w:cs="Times New Roman"/>
+              </w:rPr>
+            </w:pPr>
+            <w:r>
+              <w:rPr>
+                <w:rFonts w:ascii="Times New Roman" w:hAnsi="Times New Roman" w:cs="Times New Roman"/>
+              </w:rPr>
+              <w:t>Model’s predicted probability of shooting</w:t>
+            </w:r>
+          </w:p>
+        </w:tc>
+      </w:tr>
+      <w:tr>
+        <w:tc>
+          <w:tcPr>
+            <w:tcW w:w="0" w:type="auto"/>
+            <w:tcBorders>
+              <w:top w:val="single" w:sz="4" w:space="0" w:color="D1D9E0"/>
+              <w:left w:val="single" w:sz="4" w:space="0" w:color="D1D9E0"/>
+              <w:bottom w:val="single" w:sz="4" w:space="0" w:color="D1D9E0"/>
+              <w:right w:val="single" w:sz="4" w:space="0" w:color="D1D9E0"/>
+            </w:tcBorders>
+            <w:shd w:val="clear" w:color="auto" w:fill="FFFFFF"/>
+            <w:tcMar>
+              <w:top w:w="90" w:type="dxa"/>
+              <w:left w:w="195" w:type="dxa"/>
+              <w:bottom w:w="90" w:type="dxa"/>
+              <w:right w:w="195" w:type="dxa"/>
+            </w:tcMar>
+            <w:vAlign w:val="center"/>
+            <w:hideMark/>
+          </w:tcPr>
+          <w:p>
+            <w:pPr>
+              <w:jc w:val="center"/>
+              <w:rPr>
+                <w:rFonts w:ascii="Times New Roman" w:hAnsi="Times New Roman" w:cs="Times New Roman"/>
+              </w:rPr>
+            </w:pPr>
+            <w:proofErr w:type="spellStart"/>
+            <w:r>
+              <w:rPr>
+                <w:rFonts w:ascii="Times New Roman" w:hAnsi="Times New Roman" w:cs="Times New Roman"/>
+              </w:rPr>
+              <w:t>shap</w:t>
+            </w:r>
+            <w:proofErr w:type="spellEnd"/>
+            <w:r>
+              <w:rPr>
+                <w:rFonts w:ascii="Times New Roman" w:hAnsi="Times New Roman" w:cs="Times New Roman"/>
+              </w:rPr>
+              <w:t>_*</w:t>
+            </w:r>
+          </w:p>
+        </w:tc>
+        <w:tc>
+          <w:tcPr>
+            <w:tcW w:w="0" w:type="auto"/>
+            <w:tcBorders>
+              <w:top w:val="single" w:sz="4" w:space="0" w:color="D1D9E0"/>
+              <w:left w:val="single" w:sz="4" w:space="0" w:color="D1D9E0"/>
+              <w:bottom w:val="single" w:sz="4" w:space="0" w:color="D1D9E0"/>
+              <w:right w:val="single" w:sz="4" w:space="0" w:color="D1D9E0"/>
+            </w:tcBorders>
+            <w:shd w:val="clear" w:color="auto" w:fill="FFFFFF"/>
+            <w:tcMar>
+              <w:top w:w="90" w:type="dxa"/>
+              <w:left w:w="195" w:type="dxa"/>
+              <w:bottom w:w="90" w:type="dxa"/>
+              <w:right w:w="195" w:type="dxa"/>
+            </w:tcMar>
+            <w:vAlign w:val="center"/>
+            <w:hideMark/>
+          </w:tcPr>
+          <w:p>
+            <w:pPr>
+              <w:jc w:val="center"/>
+              <w:rPr>
+                <w:rFonts w:ascii="Times New Roman" w:hAnsi="Times New Roman" w:cs="Times New Roman"/>
+              </w:rPr>
+            </w:pPr>
+            <w:r>
+              <w:rPr>
+                <w:rFonts w:ascii="Times New Roman" w:hAnsi="Times New Roman" w:cs="Times New Roman"/>
+              </w:rPr>
+              <w:t>SHAP values for each feature</w:t>
+            </w:r>
+          </w:p>
+        </w:tc>
+      </w:tr>
+    </w:tbl>
+    <w:p>
+      <w:pPr>
+        <w:rPr>
+          <w:rFonts w:ascii="Times New Roman" w:hAnsi="Times New Roman" w:cs="Times New Roman"/>
+          <w:b/>
+          <w:bCs/>
+        </w:rPr>
+      </w:pPr>
+    </w:p>
+    <w:p>
+      <w:pPr>
+        <w:rPr>
+          <w:rFonts w:ascii="Times New Roman" w:hAnsi="Times New Roman" w:cs="Times New Roman"/>
+        </w:rPr>
+      </w:pPr>
+      <w:r>
+        <w:rPr>
+          <w:rFonts w:ascii="Times New Roman" w:hAnsi="Times New Roman" w:cs="Times New Roman"/>
+          <w:b/>
+          <w:bCs/>
+        </w:rPr>
+        <w:t>Last updated</w:t>
+      </w:r>
+      <w:r>
+        <w:rPr>
+          <w:rFonts w:ascii="Times New Roman" w:hAnsi="Times New Roman" w:cs="Times New Roman"/>
+        </w:rPr>
+        <w:t>: April 2026</w:t>
+      </w:r>
+    </w:p>
+    <w:p>
+      <w:pPr>
+        <w:rPr>
+          <w:rFonts w:ascii="Times New Roman" w:hAnsi="Times New Roman" w:cs="Times New Roman"/>
+        </w:rPr>
+      </w:pPr>
     </w:p>
     <w:sectPr>
       <w:pgSz w:w="12240" w:h="15840"/>
@@ -1803,6 +2681,155 @@
     </w:lvl>
   </w:abstractNum>
   <w:abstractNum w:abstractNumId="1" w15:restartNumberingAfterBreak="0">
+    <w:nsid w:val="1F7C177B"/>
+    <w:multiLevelType w:val="multilevel"/>
+    <w:tmpl w:val="DE7A9EC4"/>
+    <w:lvl w:ilvl="0">
+      <w:start w:val="1"/>
+      <w:numFmt w:val="bullet"/>
+      <w:lvlText w:val=""/>
+      <w:lvlJc w:val="left"/>
+      <w:pPr>
+        <w:tabs>
+          <w:tab w:val="num" w:pos="720"/>
+        </w:tabs>
+        <w:ind w:left="720" w:hanging="360"/>
+      </w:pPr>
+      <w:rPr>
+        <w:rFonts w:ascii="Symbol" w:hAnsi="Symbol" w:hint="default"/>
+        <w:sz w:val="20"/>
+      </w:rPr>
+    </w:lvl>
+    <w:lvl w:ilvl="1" w:tentative="1">
+      <w:start w:val="1"/>
+      <w:numFmt w:val="bullet"/>
+      <w:lvlText w:val="o"/>
+      <w:lvlJc w:val="left"/>
+      <w:pPr>
+        <w:tabs>
+          <w:tab w:val="num" w:pos="1440"/>
+        </w:tabs>
+        <w:ind w:left="1440" w:hanging="360"/>
+      </w:pPr>
+      <w:rPr>
+        <w:rFonts w:ascii="Courier New" w:hAnsi="Courier New" w:hint="default"/>
+        <w:sz w:val="20"/>
+      </w:rPr>
+    </w:lvl>
+    <w:lvl w:ilvl="2" w:tentative="1">
+      <w:start w:val="1"/>
+      <w:numFmt w:val="bullet"/>
+      <w:lvlText w:val=""/>
+      <w:lvlJc w:val="left"/>
+      <w:pPr>
+        <w:tabs>
+          <w:tab w:val="num" w:pos="2160"/>
+        </w:tabs>
+        <w:ind w:left="2160" w:hanging="360"/>
+      </w:pPr>
+      <w:rPr>
+        <w:rFonts w:ascii="Wingdings" w:hAnsi="Wingdings" w:hint="default"/>
+        <w:sz w:val="20"/>
+      </w:rPr>
+    </w:lvl>
+    <w:lvl w:ilvl="3" w:tentative="1">
+      <w:start w:val="1"/>
+      <w:numFmt w:val="bullet"/>
+      <w:lvlText w:val=""/>
+      <w:lvlJc w:val="left"/>
+      <w:pPr>
+        <w:tabs>
+          <w:tab w:val="num" w:pos="2880"/>
+        </w:tabs>
+        <w:ind w:left="2880" w:hanging="360"/>
+      </w:pPr>
+      <w:rPr>
+        <w:rFonts w:ascii="Wingdings" w:hAnsi="Wingdings" w:hint="default"/>
+        <w:sz w:val="20"/>
+      </w:rPr>
+    </w:lvl>
+    <w:lvl w:ilvl="4" w:tentative="1">
+      <w:start w:val="1"/>
+      <w:numFmt w:val="bullet"/>
+      <w:lvlText w:val=""/>
+      <w:lvlJc w:val="left"/>
+      <w:pPr>
+        <w:tabs>
+          <w:tab w:val="num" w:pos="3600"/>
+        </w:tabs>
+        <w:ind w:left="3600" w:hanging="360"/>
+      </w:pPr>
+      <w:rPr>
+        <w:rFonts w:ascii="Wingdings" w:hAnsi="Wingdings" w:hint="default"/>
+        <w:sz w:val="20"/>
+      </w:rPr>
+    </w:lvl>
+    <w:lvl w:ilvl="5" w:tentative="1">
+      <w:start w:val="1"/>
+      <w:numFmt w:val="bullet"/>
+      <w:lvlText w:val=""/>
+      <w:lvlJc w:val="left"/>
+      <w:pPr>
+        <w:tabs>
+          <w:tab w:val="num" w:pos="4320"/>
+        </w:tabs>
+        <w:ind w:left="4320" w:hanging="360"/>
+      </w:pPr>
+      <w:rPr>
+        <w:rFonts w:ascii="Wingdings" w:hAnsi="Wingdings" w:hint="default"/>
+        <w:sz w:val="20"/>
+      </w:rPr>
+    </w:lvl>
+    <w:lvl w:ilvl="6" w:tentative="1">
+      <w:start w:val="1"/>
+      <w:numFmt w:val="bullet"/>
+      <w:lvlText w:val=""/>
+      <w:lvlJc w:val="left"/>
+      <w:pPr>
+        <w:tabs>
+          <w:tab w:val="num" w:pos="5040"/>
+        </w:tabs>
+        <w:ind w:left="5040" w:hanging="360"/>
+      </w:pPr>
+      <w:rPr>
+        <w:rFonts w:ascii="Wingdings" w:hAnsi="Wingdings" w:hint="default"/>
+        <w:sz w:val="20"/>
+      </w:rPr>
+    </w:lvl>
+    <w:lvl w:ilvl="7" w:tentative="1">
+      <w:start w:val="1"/>
+      <w:numFmt w:val="bullet"/>
+      <w:lvlText w:val=""/>
+      <w:lvlJc w:val="left"/>
+      <w:pPr>
+        <w:tabs>
+          <w:tab w:val="num" w:pos="5760"/>
+        </w:tabs>
+        <w:ind w:left="5760" w:hanging="360"/>
+      </w:pPr>
+      <w:rPr>
+        <w:rFonts w:ascii="Wingdings" w:hAnsi="Wingdings" w:hint="default"/>
+        <w:sz w:val="20"/>
+      </w:rPr>
+    </w:lvl>
+    <w:lvl w:ilvl="8" w:tentative="1">
+      <w:start w:val="1"/>
+      <w:numFmt w:val="bullet"/>
+      <w:lvlText w:val=""/>
+      <w:lvlJc w:val="left"/>
+      <w:pPr>
+        <w:tabs>
+          <w:tab w:val="num" w:pos="6480"/>
+        </w:tabs>
+        <w:ind w:left="6480" w:hanging="360"/>
+      </w:pPr>
+      <w:rPr>
+        <w:rFonts w:ascii="Wingdings" w:hAnsi="Wingdings" w:hint="default"/>
+        <w:sz w:val="20"/>
+      </w:rPr>
+    </w:lvl>
+  </w:abstractNum>
+  <w:abstractNum w:abstractNumId="2" w15:restartNumberingAfterBreak="0">
     <w:nsid w:val="24B90496"/>
     <w:multiLevelType w:val="multilevel"/>
     <w:tmpl w:val="3AAC391C"/>
@@ -1951,7 +2978,7 @@
       </w:rPr>
     </w:lvl>
   </w:abstractNum>
-  <w:abstractNum w:abstractNumId="2" w15:restartNumberingAfterBreak="0">
+  <w:abstractNum w:abstractNumId="3" w15:restartNumberingAfterBreak="0">
     <w:nsid w:val="40FC3286"/>
     <w:multiLevelType w:val="multilevel"/>
     <w:tmpl w:val="F628E3F8"/>
@@ -2100,7 +3127,7 @@
       </w:rPr>
     </w:lvl>
   </w:abstractNum>
-  <w:abstractNum w:abstractNumId="3" w15:restartNumberingAfterBreak="0">
+  <w:abstractNum w:abstractNumId="4" w15:restartNumberingAfterBreak="0">
     <w:nsid w:val="65CC1A6D"/>
     <w:multiLevelType w:val="multilevel"/>
     <w:tmpl w:val="D7045886"/>
@@ -2249,7 +3276,7 @@
       </w:rPr>
     </w:lvl>
   </w:abstractNum>
-  <w:abstractNum w:abstractNumId="4" w15:restartNumberingAfterBreak="0">
+  <w:abstractNum w:abstractNumId="5" w15:restartNumberingAfterBreak="0">
     <w:nsid w:val="6D576718"/>
     <w:multiLevelType w:val="multilevel"/>
     <w:tmpl w:val="AAA858E8"/>
@@ -2399,19 +3426,22 @@
     </w:lvl>
   </w:abstractNum>
   <w:num w:numId="1" w16cid:durableId="934482999">
+    <w:abstractNumId w:val="4"/>
+  </w:num>
+  <w:num w:numId="2" w16cid:durableId="839275956">
     <w:abstractNumId w:val="3"/>
   </w:num>
-  <w:num w:numId="2" w16cid:durableId="839275956">
+  <w:num w:numId="3" w16cid:durableId="511338585">
     <w:abstractNumId w:val="2"/>
-  </w:num>
-  <w:num w:numId="3" w16cid:durableId="511338585">
-    <w:abstractNumId w:val="1"/>
   </w:num>
   <w:num w:numId="4" w16cid:durableId="651056629">
     <w:abstractNumId w:val="0"/>
   </w:num>
   <w:num w:numId="5" w16cid:durableId="189296104">
-    <w:abstractNumId w:val="4"/>
+    <w:abstractNumId w:val="5"/>
+  </w:num>
+  <w:num w:numId="6" w16cid:durableId="706639085">
+    <w:abstractNumId w:val="1"/>
   </w:num>
 </w:numbering>
 </file>

</xml_diff>